<commit_message>
Update Quarto templates with GHformats branding
- Update PDF report template with new cover image references
- Update LaTeX styling files (_coverpage.tex, _titlepage.tex, in-header.tex)
- Update PDF simple template skeleton and LaTeX headers
- Update Word templates with new branding
- Add packages.bib for PDF report bibliography support

Co-Authored-By: Claude Sonnet 4.5 <noreply@anthropic.com>
</commit_message>
<xml_diff>
--- a/inst/quarto/templates/word/resources/gh-template-HelveticaNeue.docx
+++ b/inst/quarto/templates/word/resources/gh-template-HelveticaNeue.docx
@@ -77,6 +77,94 @@
         </w:rPr>
         <w:t>2022/07/20</w:t>
       </w:r>
+    </w:p>
+    <w:p>
+      <w:pPr>
+        <w:rPr>
+          <w:rFonts w:ascii="Helvetica Neue" w:hAnsi="Helvetica Neue"/>
+          <w:lang w:val="en-US"/>
+        </w:rPr>
+      </w:pPr>
+    </w:p>
+    <w:p>
+      <w:pPr>
+        <w:rPr>
+          <w:rFonts w:ascii="Helvetica Neue" w:hAnsi="Helvetica Neue"/>
+          <w:lang w:val="en-US"/>
+        </w:rPr>
+      </w:pPr>
+    </w:p>
+    <w:p>
+      <w:pPr>
+        <w:rPr>
+          <w:rFonts w:ascii="Helvetica Neue" w:hAnsi="Helvetica Neue"/>
+          <w:lang w:val="en-US"/>
+        </w:rPr>
+      </w:pPr>
+    </w:p>
+    <w:p>
+      <w:pPr>
+        <w:rPr>
+          <w:rFonts w:ascii="Helvetica Neue" w:hAnsi="Helvetica Neue"/>
+          <w:lang w:val="en-US"/>
+        </w:rPr>
+      </w:pPr>
+    </w:p>
+    <w:p>
+      <w:pPr>
+        <w:rPr>
+          <w:rFonts w:ascii="Helvetica Neue" w:hAnsi="Helvetica Neue"/>
+          <w:lang w:val="en-US"/>
+        </w:rPr>
+      </w:pPr>
+    </w:p>
+    <w:p>
+      <w:pPr>
+        <w:rPr>
+          <w:rFonts w:ascii="Helvetica Neue" w:hAnsi="Helvetica Neue"/>
+          <w:lang w:val="en-US"/>
+        </w:rPr>
+      </w:pPr>
+    </w:p>
+    <w:p>
+      <w:pPr>
+        <w:rPr>
+          <w:rFonts w:ascii="Helvetica Neue" w:hAnsi="Helvetica Neue"/>
+          <w:lang w:val="en-US"/>
+        </w:rPr>
+      </w:pPr>
+    </w:p>
+    <w:p>
+      <w:pPr>
+        <w:rPr>
+          <w:rFonts w:ascii="Helvetica Neue" w:hAnsi="Helvetica Neue"/>
+          <w:lang w:val="en-US"/>
+        </w:rPr>
+      </w:pPr>
+    </w:p>
+    <w:p>
+      <w:pPr>
+        <w:rPr>
+          <w:rFonts w:ascii="Helvetica Neue" w:hAnsi="Helvetica Neue"/>
+          <w:lang w:val="en-US"/>
+        </w:rPr>
+      </w:pPr>
+    </w:p>
+    <w:p>
+      <w:pPr>
+        <w:rPr>
+          <w:rFonts w:ascii="Helvetica Neue" w:hAnsi="Helvetica Neue"/>
+          <w:lang w:val="en-US"/>
+        </w:rPr>
+      </w:pPr>
+    </w:p>
+    <w:p>
+      <w:pPr>
+        <w:rPr>
+          <w:rFonts w:ascii="Helvetica Neue" w:hAnsi="Helvetica Neue"/>
+          <w:lang w:val="en-US"/>
+        </w:rPr>
+      </w:pPr>
     </w:p>
     <w:p>
       <w:pPr>
@@ -236,17 +324,17 @@
       <w:pStyle w:val="Header"/>
       <w:jc w:val="right"/>
     </w:pPr>
-    <w:r>
-      <w:t xml:space="preserve">Running </w:t>
-    </w:r>
-    <w:proofErr w:type="spellStart"/>
-    <w:r>
-      <w:t>Document</w:t>
-    </w:r>
-    <w:proofErr w:type="spellEnd"/>
-    <w:r>
-      <w:t xml:space="preserve"> Title</w:t>
-    </w:r>
+    <w:fldSimple w:instr=" STYLEREF &quot;Heading 1&quot; \* MERGEFORMAT ">
+      <w:r>
+        <w:rPr>
+          <w:b/>
+          <w:bCs/>
+          <w:noProof/>
+          <w:lang w:val="en-US"/>
+        </w:rPr>
+        <w:t>foo</w:t>
+      </w:r>
+    </w:fldSimple>
   </w:p>
 </w:hdr>
 </file>
@@ -2614,9 +2702,9 @@
     <w:name w:val="Hyperlink"/>
     <w:basedOn w:val="DefaultParagraphFont"/>
     <w:uiPriority w:val="99"/>
-    <w:rsid w:val="00AB5A90"/>
-    <w:rPr>
-      <w:color w:val="0271BB" w:themeColor="hyperlink"/>
+    <w:rsid w:val="008952AA"/>
+    <w:rPr>
+      <w:color w:val="B70000"/>
       <w:u w:val="single"/>
     </w:rPr>
   </w:style>
@@ -2899,7 +2987,6 @@
     <w:next w:val="Normal"/>
     <w:link w:val="DateChar"/>
     <w:uiPriority w:val="99"/>
-    <w:semiHidden/>
     <w:unhideWhenUsed/>
     <w:rsid w:val="00725CBC"/>
     <w:pPr>
@@ -2916,7 +3003,6 @@
     <w:basedOn w:val="DefaultParagraphFont"/>
     <w:link w:val="Date"/>
     <w:uiPriority w:val="99"/>
-    <w:semiHidden/>
     <w:rsid w:val="00725CBC"/>
     <w:rPr>
       <w:rFonts w:asciiTheme="majorHAnsi" w:hAnsiTheme="majorHAnsi"/>

</xml_diff>